<commit_message>
feat: enhance update request workflow and UI
- Add email requirement and scope tracking to update requests
- Implement request deletion and rejection reason workflows
- Update Firestore rules to permit request deletion
- Add visual confirmation modals for category and request management
</commit_message>
<xml_diff>
--- a/vacancy_announcement.docx
+++ b/vacancy_announcement.docx
@@ -633,62 +633,41 @@
         <w:rPr>
           <w:rFonts w:ascii="Arial" w:eastAsia="Arial" w:hAnsi="Arial" w:cs="Arial"/>
         </w:rPr>
-        <w:t>. Include any skills or experience you have that may further qualify you for the position. Your memorandum must include your Element Leader’s Signature. Detailed application instructions, including a memo template, can be found on th</w:t>
-      </w:r>
-      <w:r>
-        <w:rPr>
-          <w:rFonts w:ascii="Arial" w:eastAsia="Arial" w:hAnsi="Arial" w:cs="Arial"/>
-        </w:rPr>
-        <w:t>e</w:t>
-      </w:r>
-      <w:r>
-        <w:rPr>
-          <w:rFonts w:ascii="Arial" w:eastAsia="Arial" w:hAnsi="Arial" w:cs="Arial"/>
-        </w:rPr>
-        <w:t xml:space="preserve"> CD Teams page</w:t>
-      </w:r>
-      <w:r>
-        <w:rPr>
-          <w:rFonts w:ascii="Arial" w:eastAsia="Arial" w:hAnsi="Arial" w:cs="Arial"/>
-        </w:rPr>
-        <w:t xml:space="preserve"> here</w:t>
-      </w:r>
-      <w:r>
-        <w:rPr>
-          <w:rFonts w:ascii="Arial" w:eastAsia="Arial" w:hAnsi="Arial" w:cs="Arial"/>
-        </w:rPr>
-        <w:t xml:space="preserve">: </w:t>
-      </w:r>
-      <w:hyperlink r:id="rId6" w:history="1">
-        <w:r>
-          <w:rPr>
-            <w:rStyle w:val="Hyperlink"/>
-            <w:rFonts w:ascii="Arial" w:eastAsia="Arial" w:hAnsi="Arial" w:cs="Arial"/>
-          </w:rPr>
-          <w:t>Procedure to Apply for a Unit Broadening Position.</w:t>
-        </w:r>
-      </w:hyperlink>
-    </w:p>
-    <w:p>
-      <w:pPr>
-        <w:suppressAutoHyphens/>
-        <w:rPr>
-          <w:rFonts w:ascii="Arial" w:eastAsia="Arial" w:hAnsi="Arial" w:cs="Arial"/>
-        </w:rPr>
-      </w:pPr>
-    </w:p>
-    <w:p>
-      <w:pPr>
-        <w:suppressAutoHyphens/>
-        <w:rPr>
-          <w:rFonts w:ascii="Arial" w:eastAsia="Arial" w:hAnsi="Arial" w:cs="Arial"/>
-        </w:rPr>
-      </w:pPr>
-      <w:r>
-        <w:rPr>
-          <w:rFonts w:ascii="Arial" w:eastAsia="Arial" w:hAnsi="Arial" w:cs="Arial"/>
-        </w:rPr>
-        <w:t xml:space="preserve">5.  Submit any questions and memorandum to [Rank </w:t>
+        <w:t>. Include any skills or experience you have that may further qualify you for the position. Your memorandum must include your Element Leader’s Signature.</w:t>
+      </w:r>
+    </w:p>
+    <w:p>
+      <w:pPr>
+        <w:suppressAutoHyphens/>
+        <w:rPr>
+          <w:rFonts w:ascii="Arial" w:eastAsia="Arial" w:hAnsi="Arial" w:cs="Arial"/>
+        </w:rPr>
+      </w:pPr>
+    </w:p>
+    <w:p>
+      <w:pPr>
+        <w:suppressAutoHyphens/>
+        <w:rPr>
+          <w:rFonts w:ascii="Arial" w:eastAsia="Arial" w:hAnsi="Arial" w:cs="Arial"/>
+        </w:rPr>
+      </w:pPr>
+      <w:r>
+        <w:rPr>
+          <w:rFonts w:ascii="Arial" w:eastAsia="Arial" w:hAnsi="Arial" w:cs="Arial"/>
+        </w:rPr>
+        <w:t xml:space="preserve">5.  Submit any questions and </w:t>
+      </w:r>
+      <w:r>
+        <w:rPr>
+          <w:rFonts w:ascii="Arial" w:eastAsia="Arial" w:hAnsi="Arial" w:cs="Arial"/>
+        </w:rPr>
+        <w:t xml:space="preserve">signed </w:t>
+      </w:r>
+      <w:r>
+        <w:rPr>
+          <w:rFonts w:ascii="Arial" w:eastAsia="Arial" w:hAnsi="Arial" w:cs="Arial"/>
+        </w:rPr>
+        <w:t xml:space="preserve">memorandum to [Rank </w:t>
       </w:r>
       <w:r>
         <w:rPr>
@@ -903,11 +882,11 @@
       </w:pPr>
     </w:p>
     <w:sectPr>
-      <w:headerReference w:type="even" r:id="rId7"/>
-      <w:headerReference w:type="default" r:id="rId8"/>
-      <w:footerReference w:type="even" r:id="rId9"/>
-      <w:footerReference w:type="default" r:id="rId10"/>
-      <w:headerReference w:type="first" r:id="rId11"/>
+      <w:headerReference w:type="even" r:id="rId6"/>
+      <w:headerReference w:type="default" r:id="rId7"/>
+      <w:footerReference w:type="even" r:id="rId8"/>
+      <w:footerReference w:type="default" r:id="rId9"/>
+      <w:headerReference w:type="first" r:id="rId10"/>
       <w:pgSz w:w="612pt" w:h="792pt"/>
       <w:pgMar w:top="35pt" w:right="72pt" w:bottom="72pt" w:left="72pt" w:header="36pt" w:footer="36pt" w:gutter="0pt"/>
       <w:cols w:space="36pt"/>

</xml_diff>